<commit_message>
Reescreve fichamento e remove material da supervisao das referencias
O roteiro fornecido pela supervisao deixa de ser tratado como obra
fichada em ABNT: sai da lista de referencias e das citacoes autor-data,
passando a ser mencionado em prosa como ponto de partida do trabalho.

Restam como referencias apenas as fontes publicadas: Cangucu (2021),
Freire, Sousa e Hessel (2024), Leonardi e Meyer (2015), Resolucao CFP
001/2009, Manual Orientativo do CFP (2025) e IBAC (2024).

Texto reescrito em registro mais natural, com periodos de extensao
variada e menos construcoes formulaicas.

Co-Authored-By: Claude Opus 5 <noreply@anthropic.com>
Claude-Session: https://claude.ai/code/session_017Djp27eCPHXbKSnZ5tsU66
</commit_message>
<xml_diff>
--- a/fichamento/Fichamento_Estudo_de_Caso.docx
+++ b/fichamento/Fichamento_Estudo_de_Caso.docx
@@ -15,7 +15,217 @@
           <w:sz w:val="24"/>
           <w:szCs w:val="24"/>
         </w:rPr>
-        <w:t xml:space="preserve">FICHAMENTO — A CONSTRUÇÃO DO ESTUDO DE CASO CLÍNICO NAS ABORDAGENS COMPORTAMENTAIS E COGNITIVO-COMPORTAMENTAIS</w:t>
+        <w:t xml:space="preserve">FICHAMENTO — COMO ELABORAR UM ESTUDO DE CASO CLÍNICO NAS ABORDAGENS COMPORTAMENTAIS E COGNITIVO-COMPORTAMENTAIS</w:t>
+      </w:r>
+    </w:p>
+    <w:p>
+      <w:pPr>
+        <w:spacing w:after="0" w:line="360"/>
+        <w:ind w:firstLine="708"/>
+        <w:jc w:val="both"/>
+      </w:pPr>
+      <w:r>
+        <w:rPr>
+          <w:rFonts w:ascii="Times New Roman" w:cs="Times New Roman" w:eastAsia="Times New Roman" w:hAnsi="Times New Roman"/>
+          <w:sz w:val="24"/>
+          <w:szCs w:val="24"/>
+        </w:rPr>
+        <w:t xml:space="preserve">O roteiro oferecido pela supervisão começa por uma distinção que vale reter: prontuário, registro de sessão, formulação e estudo de caso não são a mesma coisa. O prontuário acompanha a prestação do serviço e cumpre função técnica e legal. O registro de sessão é o relato sintético de um atendimento. A formulação organiza as informações para orientar decisões clínicas. Já o estudo de caso é produção acadêmica, e articula dados, teoria, hipóteses, intervenção e evolução preservando o sigilo. Copiar o prontuário não produz um estudo de caso.</w:t>
+      </w:r>
+    </w:p>
+    <w:p>
+      <w:pPr>
+        <w:spacing w:after="0" w:line="360"/>
+        <w:ind w:firstLine="708"/>
+        <w:jc w:val="both"/>
+      </w:pPr>
+      <w:r>
+        <w:rPr>
+          <w:rFonts w:ascii="Times New Roman" w:cs="Times New Roman" w:eastAsia="Times New Roman" w:hAnsi="Times New Roman"/>
+          <w:sz w:val="24"/>
+          <w:szCs w:val="24"/>
+        </w:rPr>
+        <w:t xml:space="preserve">Essa exigência não é idiossincrasia das abordagens comportamentais. Canguçu (2021, p. 20) chega ao mesmo lugar pela psicanálise, ao afirmar que construir um caso “não consiste em descrições protocolares nem se reduz a registros de prontuários”. E vai além: “ter um paciente não é o mesmo que ter um caso clínico – por isso, o caso precisa necessariamente ser construído”. Que dois campos tão distantes convirjam nesse ponto sugere que é a elaboração, e não a transcrição, o que define o gênero.</w:t>
+      </w:r>
+    </w:p>
+    <w:p>
+      <w:pPr>
+        <w:spacing w:after="0" w:line="360"/>
+        <w:ind w:firstLine="708"/>
+        <w:jc w:val="both"/>
+      </w:pPr>
+      <w:r>
+        <w:rPr>
+          <w:rFonts w:ascii="Times New Roman" w:cs="Times New Roman" w:eastAsia="Times New Roman" w:hAnsi="Times New Roman"/>
+          <w:sz w:val="24"/>
+          <w:szCs w:val="24"/>
+        </w:rPr>
+        <w:t xml:space="preserve">O princípio que sustenta todo o restante é fácil de enunciar e difícil de cumprir: os dados vêm antes da hipótese. Primeiro se coleta e se observa, depois se identificam padrões, e só então se formulam hipóteses, objetivos e intervenções, que passam a ser monitorados. O erro mais frequente é o percurso inverso, começar pela teoria e encaixar o paciente nela. Dizer que o paciente é ansioso porque tem baixa autoestima apresenta uma conclusão sem mostrar como se chegou até ela. Descrever que, diante de situações de exposição social, ele antecipa consequências negativas, esquiva-se e sente alívio logo depois é outra coisa, porque a formulação continua presa ao que foi observado.</w:t>
+      </w:r>
+    </w:p>
+    <w:p>
+      <w:pPr>
+        <w:spacing w:after="0" w:line="360"/>
+        <w:ind w:firstLine="708"/>
+        <w:jc w:val="both"/>
+      </w:pPr>
+      <w:r>
+        <w:rPr>
+          <w:rFonts w:ascii="Times New Roman" w:cs="Times New Roman" w:eastAsia="Times New Roman" w:hAnsi="Times New Roman"/>
+          <w:sz w:val="24"/>
+          <w:szCs w:val="24"/>
+        </w:rPr>
+        <w:t xml:space="preserve">Daí vem a exigência de operacionalizar. “É inseguro” e “é resistente” não descrevem comportamento algum. Pedir confirmação a todo momento, reler mensagens várias vezes antes de enviar, largar a tarefa ao primeiro sinal de erro: isso é observável, e é isso que entra no texto. A exigência não é preciosismo metodológico. Leonardi e Meyer (2015, p. 1148) lembram que a intuição clínica</w:t>
+      </w:r>
+    </w:p>
+    <w:p>
+      <w:pPr>
+        <w:spacing w:after="240" w:before="240" w:line="240"/>
+        <w:ind w:left="2268"/>
+        <w:jc w:val="both"/>
+      </w:pPr>
+      <w:r>
+        <w:rPr>
+          <w:rFonts w:ascii="Times New Roman" w:cs="Times New Roman" w:eastAsia="Times New Roman" w:hAnsi="Times New Roman"/>
+          <w:sz w:val="22"/>
+          <w:szCs w:val="22"/>
+        </w:rPr>
+        <w:t xml:space="preserve">costuma estar repleta de vieses, falhas e distorções, a ponto de o terapeuta enxergar sucesso quando há indícios de fracasso. […] a perícia clínica é concebida como um conjunto rigoroso de competências que complementa (e não rivaliza com) a melhor evidência disponível.</w:t>
+      </w:r>
+    </w:p>
+    <w:p>
+      <w:pPr>
+        <w:spacing w:after="0" w:line="360"/>
+        <w:ind w:firstLine="708"/>
+        <w:jc w:val="both"/>
+      </w:pPr>
+      <w:r>
+        <w:rPr>
+          <w:rFonts w:ascii="Times New Roman" w:cs="Times New Roman" w:eastAsia="Times New Roman" w:hAnsi="Times New Roman"/>
+          <w:sz w:val="24"/>
+          <w:szCs w:val="24"/>
+        </w:rPr>
+        <w:t xml:space="preserve">As informações vêm da entrevista, da observação e, quando há indicação técnica e autorização, de instrumentos e registros comportamentais. Na entrevista interessa saber quando o problema começou, com que frequência e intensidade aparece, em que situações ocorre e, igualmente importante, em que situações não ocorre, o que acontece depois e o que já foi tentado antes. A observação pede o mesmo rigor: “paciente estava estranho” não informa nada, ao passo que registrar a redução do contato visual e a mudança de assunto quando certo tema aparece informa bastante. A identificação é codificada, e a história de vida entra apenas na medida em que ajude a entender o caso, nunca como biografia.</w:t>
+      </w:r>
+    </w:p>
+    <w:p>
+      <w:pPr>
+        <w:spacing w:after="0" w:line="360"/>
+        <w:ind w:firstLine="708"/>
+        <w:jc w:val="both"/>
+      </w:pPr>
+      <w:r>
+        <w:rPr>
+          <w:rFonts w:ascii="Times New Roman" w:cs="Times New Roman" w:eastAsia="Times New Roman" w:hAnsi="Times New Roman"/>
+          <w:sz w:val="24"/>
+          <w:szCs w:val="24"/>
+        </w:rPr>
+        <w:t xml:space="preserve">O eixo da análise é funcional: antecedentes, resposta e consequências, com atenção às operações estabelecedoras e aos efeitos de longo prazo. Na terapia cognitivo-comportamental, acrescenta-se a leitura da situação, dos pensamentos automáticos, das emoções, dos comportamentos e das crenças intermediárias e centrais, com o modelo ABC como recurso de organização. Vale insistir num ponto: crenças não se atribuem ao paciente por dedução teórica, constroem-se a partir do que a avaliação mostrou. A organização se fecha separando fatores predisponentes, precipitantes, mantenedores e de proteção e levantando recursos e obstáculos, itens vindos de Freire, Sousa e Hessel (2024).</w:t>
+      </w:r>
+    </w:p>
+    <w:p>
+      <w:pPr>
+        <w:spacing w:after="0" w:line="360"/>
+        <w:ind w:firstLine="708"/>
+        <w:jc w:val="both"/>
+      </w:pPr>
+      <w:r>
+        <w:rPr>
+          <w:rFonts w:ascii="Times New Roman" w:cs="Times New Roman" w:eastAsia="Times New Roman" w:hAnsi="Times New Roman"/>
+          <w:sz w:val="24"/>
+          <w:szCs w:val="24"/>
+        </w:rPr>
+        <w:t xml:space="preserve">A hipótese clínica responde a uma pergunta: qual explicação, sustentada pelos dados de que se dispõe, organiza melhor o que o paciente apresenta? Ela não é verdade estabelecida, é hipótese de trabalho, e deve ser revista quando novos dados aparecerem. Dela saem os objetivos de curto, médio e longo prazo, divisão também tomada daqueles autores, e as intervenções. Cada intervenção precisa responder por que foi escolhida para aquele paciente. Listar respiração, reestruturação cognitiva, exposição e relaxamento não explica nada. Dizer que a exposição gradual foi planejada porque a hipótese é de que a esquiva mantém o quadro, sim. A técnica serve à formulação, nunca o contrário.</w:t>
+      </w:r>
+    </w:p>
+    <w:p>
+      <w:pPr>
+        <w:spacing w:after="0" w:line="360"/>
+        <w:ind w:firstLine="708"/>
+        <w:jc w:val="both"/>
+      </w:pPr>
+      <w:r>
+        <w:rPr>
+          <w:rFonts w:ascii="Times New Roman" w:cs="Times New Roman" w:eastAsia="Times New Roman" w:hAnsi="Times New Roman"/>
+          <w:sz w:val="24"/>
+          <w:szCs w:val="24"/>
+        </w:rPr>
+        <w:t xml:space="preserve">Monitorar significa mostrar mudança: frequência, intensidade, duração, ampliação de repertório e, quando possível, comparação de medidas antes e depois. É aqui que está a advertência metodológica mais importante de todas. Melhora que vem depois da intervenção não prova que a intervenção causou a melhora. Por isso se escreve “após a intervenção, observou-se” ou “os dados sugerem”, e nunca que a técnica curou o paciente. O IBAC (2024) aponta as duas limitações do relato de caso: a tendência a atribuir causalidade ao que veio antes da melhora e a baixa generalização. Nenhuma delas anula seu valor formativo.</w:t>
+      </w:r>
+    </w:p>
+    <w:p>
+      <w:pPr>
+        <w:spacing w:after="0" w:line="360"/>
+        <w:ind w:firstLine="708"/>
+        <w:jc w:val="both"/>
+      </w:pPr>
+      <w:r>
+        <w:rPr>
+          <w:rFonts w:ascii="Times New Roman" w:cs="Times New Roman" w:eastAsia="Times New Roman" w:hAnsi="Times New Roman"/>
+          <w:sz w:val="24"/>
+          <w:szCs w:val="24"/>
+        </w:rPr>
+        <w:t xml:space="preserve">No plano ético, a Resolução CFP nº 001/2009 torna obrigatório o registro decorrente da prestação de serviços psicológicos. Para quem está em estágio, o artigo 3º é o que mais importa, ao determinar que “em caso de serviço psicológico prestado em serviços-escola e campos de estágio, o registro deve contemplar a identificação e a assinatura do responsável técnico/supervisor que responderá pelo serviço prestado, bem como do estagiário” (Conselho Federal de Psicologia, 2009). O Manual orientativo acrescenta que todo registro psicológico é sigiloso e que cabe à profissional “construir um raciocínio clínico que a conduza no sentido de avaliar quais intervenções, procedimentos e observações devam ser registradas” (Conselho Federal de Psicologia, 2025). Uma ressalva se impõe: essas normas regulam o registro do serviço, não o trabalho acadêmico, que tem outra finalidade e outro destinatário.</w:t>
+      </w:r>
+    </w:p>
+    <w:p>
+      <w:pPr>
+        <w:spacing w:after="0" w:line="360"/>
+        <w:ind w:firstLine="708"/>
+        <w:jc w:val="both"/>
+      </w:pPr>
+      <w:r>
+        <w:rPr>
+          <w:rFonts w:ascii="Times New Roman" w:cs="Times New Roman" w:eastAsia="Times New Roman" w:hAnsi="Times New Roman"/>
+          <w:sz w:val="24"/>
+          <w:szCs w:val="24"/>
+        </w:rPr>
+        <w:t xml:space="preserve">Cabem, por fim, duas observações críticas, feitas em favor do roteiro e não contra ele. A primeira diz respeito ao empréstimo tomado a Freire, Sousa e Hessel (2024). Os autores adaptaram para as psicoterapias existenciais o instrumento de Eells (2015 apud Freire; Sousa; Hessel, 2024) e, no caminho, trocaram “hipóteses explanatórias” por “hipóteses compreensivas”. A troca foi deliberada, e eles explicam por quê: “diante das diversas críticas da incompatibilidade da psicopatologia fenomenológica e do pensamento existencial com o termo ‘explanatório’, já que não se pretende estabelecer relações de causalidade como nas ciências naturais” (Freire; Sousa; Hessel, 2024, p. 108). A palavra carrega uma posição epistemológica, não é escolha de estilo. Trazida para uma clínica comportamental, essa organização traz junto um vocabulário criado justamente para recusar o tipo de relação que a análise do comportamento quer estabelecer, a relação funcional entre comportamento e ambiente. A supervisão já sinaliza que não transpõe o modelo ao pé da letra, o que resolve boa parte do problema. Ainda assim, parece prudente deixar explícito, no estudo de caso, que “hipótese” ali significa relação funcional sustentada por dados, e não compreensão de sentido.</w:t>
+      </w:r>
+    </w:p>
+    <w:p>
+      <w:pPr>
+        <w:spacing w:after="0" w:line="360"/>
+        <w:ind w:firstLine="708"/>
+        <w:jc w:val="both"/>
+      </w:pPr>
+      <w:r>
+        <w:rPr>
+          <w:rFonts w:ascii="Times New Roman" w:cs="Times New Roman" w:eastAsia="Times New Roman" w:hAnsi="Times New Roman"/>
+          <w:sz w:val="24"/>
+          <w:szCs w:val="24"/>
+        </w:rPr>
+        <w:t xml:space="preserve">A segunda é de outra natureza. O roteiro e Canguçu (2021) concordam em recusar o protocolo, mas discordam sobre o que é o texto do caso. Ela sustenta, seguindo Lacan, que a escrita do caso tem “estrutura de ficção” e a trata como gênero literário, enquanto o roteiro pede descrição operacional. A divergência é real e não vale fingir que não exista. Há, porém, um ponto de encontro que costuma passar despercebido: Canguçu (2021, p. 26) observa que “as desejáveis distorções, encobrimentos e alterações necessárias para proteger o sigilo clínico pertencem ao método de tratamento”, e conta que condensou elementos de casos parecidos para construir um caso só. Isso dá à identificação codificada um fundamento teórico, e não apenas normativo.</w:t>
+      </w:r>
+    </w:p>
+    <w:p>
+      <w:pPr>
+        <w:spacing w:after="0" w:line="360"/>
+        <w:ind w:firstLine="708"/>
+        <w:jc w:val="both"/>
+      </w:pPr>
+      <w:r>
+        <w:rPr>
+          <w:rFonts w:ascii="Times New Roman" w:cs="Times New Roman" w:eastAsia="Times New Roman" w:hAnsi="Times New Roman"/>
+          <w:sz w:val="24"/>
+          <w:szCs w:val="24"/>
+        </w:rPr>
+        <w:t xml:space="preserve">Resta uma lacuna. O roteiro acerta ao proibir a inferência causal, mas trata isso como limite fixo do estudo de caso e não menciona os delineamentos de caso único. Leonardi e Meyer (2015, p. 1148) registram que a American Psychological Association “referenda diferentes tipos de métodos nomotéticos e idiográficos (ensaios clínicos randomizados, experimentos de caso único, estudos de caso)”. A fragilidade da inferência não está no caso único, está no delineamento descritivo que se escolheu. O que era uma limitação a declarar passa a ser um problema de método a enfrentar.</w:t>
+      </w:r>
+    </w:p>
+    <w:p>
+      <w:pPr>
+        <w:spacing w:after="0" w:line="360"/>
+        <w:ind w:firstLine="708"/>
+        <w:jc w:val="both"/>
+      </w:pPr>
+      <w:r>
+        <w:rPr>
+          <w:rFonts w:ascii="Times New Roman" w:cs="Times New Roman" w:eastAsia="Times New Roman" w:hAnsi="Times New Roman"/>
+          <w:sz w:val="24"/>
+          <w:szCs w:val="24"/>
+        </w:rPr>
+        <w:t xml:space="preserve">Ao final permanece a pergunta que o próprio roteiro propõe como critério de qualidade: se outro profissional lesse essa formulação, entenderia por que aquela intervenção foi escolhida? Enquanto a resposta for não, o trabalho não terminou.</w:t>
       </w:r>
     </w:p>
     <w:p>
@@ -31,7 +241,7 @@
           <w:sz w:val="24"/>
           <w:szCs w:val="24"/>
         </w:rPr>
-        <w:t xml:space="preserve">Referência da obra fichada</w:t>
+        <w:t xml:space="preserve">Referências</w:t>
       </w:r>
     </w:p>
     <w:p>
@@ -45,204 +255,25 @@
           <w:sz w:val="24"/>
           <w:szCs w:val="24"/>
         </w:rPr>
-        <w:t xml:space="preserve">MANUAL para construção de estudo de caso clínico na clínica-escola: abordagens comportamentais e cognitivo-comportamentais. [S. l.: s. n.], 2026. Material didático não publicado.</w:t>
-      </w:r>
-    </w:p>
-    <w:p>
-      <w:pPr>
-        <w:spacing w:after="240" w:before="360" w:line="360"/>
-        <w:jc w:val="left"/>
-      </w:pPr>
-      <w:r>
-        <w:rPr>
-          <w:rFonts w:ascii="Times New Roman" w:cs="Times New Roman" w:eastAsia="Times New Roman" w:hAnsi="Times New Roman"/>
-          <w:b/>
-          <w:bCs/>
-          <w:sz w:val="24"/>
-          <w:szCs w:val="24"/>
-        </w:rPr>
-        <w:t xml:space="preserve">Fichamento</w:t>
-      </w:r>
-    </w:p>
-    <w:p>
-      <w:pPr>
-        <w:spacing w:after="0" w:line="360"/>
-        <w:ind w:firstLine="708"/>
-        <w:jc w:val="both"/>
-      </w:pPr>
-      <w:r>
-        <w:rPr>
-          <w:rFonts w:ascii="Times New Roman" w:cs="Times New Roman" w:eastAsia="Times New Roman" w:hAnsi="Times New Roman"/>
-          <w:sz w:val="24"/>
-          <w:szCs w:val="24"/>
-        </w:rPr>
-        <w:t xml:space="preserve">O manual define o estudo de caso clínico como construção técnico-científica, recusando sua redução ao registro administrativo do atendimento. A distinção proposta é operativa: o prontuário é o registro técnico que acompanha a prestação do serviço; o registro de sessão, o relato sintético de um atendimento; a formulação, a organização das informações que orienta as decisões clínicas; e o estudo de caso, a produção acadêmica que articula dados, teoria, hipóteses, intervenção e evolução, preservando o sigilo. Daí as advertências de que “prontuário não é estudo de caso” e de que o estudo “não é simplesmente copiar o prontuário” (Manual…, 2026). A recusa não é exclusiva das abordagens comportamentais. Canguçu (2021, p. 20), desde a psicanálise, observa que construir um caso “não consiste em descrições protocolares nem se reduz a registros de prontuários”, acrescentando que “ter um paciente não é o mesmo que ter um caso clínico – por isso, o caso precisa necessariamente ser construído”. A convergência entre campos epistemologicamente distantes sugere que a exigência de elaboração, e não de transcrição, é constitutiva do gênero.</w:t>
-      </w:r>
-    </w:p>
-    <w:p>
-      <w:pPr>
-        <w:spacing w:after="0" w:line="360"/>
-        <w:ind w:firstLine="708"/>
-        <w:jc w:val="both"/>
-      </w:pPr>
-      <w:r>
-        <w:rPr>
-          <w:rFonts w:ascii="Times New Roman" w:cs="Times New Roman" w:eastAsia="Times New Roman" w:hAnsi="Times New Roman"/>
-          <w:sz w:val="24"/>
-          <w:szCs w:val="24"/>
-        </w:rPr>
-        <w:t xml:space="preserve">O princípio que organiza o manual é a precedência do dado sobre a hipótese: a sequência parte da coleta e da observação, passa pela identificação de padrões e chega às hipóteses, aos objetivos, à intervenção e ao monitoramento. O erro combatido é o percurso inverso, abrir o texto com uma explicação teórica e nela encaixar o paciente. O manual contrapõe a afirmação “o paciente é ansioso porque possui baixa autoestima”, que “apresenta uma conclusão sem demonstrar como ela foi construída”, à descrição das situações de exposição social em que o paciente relata antecipação de consequências negativas, esquiva e redução imediata do desconforto (Manual…, 2026). Decorre daí a exigência de operacionalização: “é inseguro” ou “é resistente” devem converter-se em comportamentos observáveis, como solicitar confirmação frequente ou abandonar tarefas diante da possibilidade de erro. A exigência tem respaldo empírico, pois Leonardi e Meyer (2015, p. 1148) registram que a intuição clínica</w:t>
-      </w:r>
-    </w:p>
-    <w:p>
-      <w:pPr>
-        <w:spacing w:after="240" w:before="240" w:line="240"/>
-        <w:ind w:left="2268"/>
-        <w:jc w:val="both"/>
-      </w:pPr>
-      <w:r>
-        <w:rPr>
-          <w:rFonts w:ascii="Times New Roman" w:cs="Times New Roman" w:eastAsia="Times New Roman" w:hAnsi="Times New Roman"/>
-          <w:sz w:val="22"/>
-          <w:szCs w:val="22"/>
-        </w:rPr>
-        <w:t xml:space="preserve">costuma estar repleta de vieses, falhas e distorções, a ponto de o terapeuta enxergar sucesso quando há indícios de fracasso. […] a perícia clínica é concebida como um conjunto rigoroso de competências que complementa (e não rivaliza com) a melhor evidência disponível.</w:t>
-      </w:r>
-    </w:p>
-    <w:p>
-      <w:pPr>
-        <w:spacing w:after="0" w:line="360"/>
-        <w:ind w:firstLine="708"/>
-        <w:jc w:val="both"/>
-      </w:pPr>
-      <w:r>
-        <w:rPr>
-          <w:rFonts w:ascii="Times New Roman" w:cs="Times New Roman" w:eastAsia="Times New Roman" w:hAnsi="Times New Roman"/>
-          <w:sz w:val="24"/>
-          <w:szCs w:val="24"/>
-        </w:rPr>
-        <w:t xml:space="preserve">As fontes previstas são a entrevista clínica, a observação e, quando tecnicamente indicado e autorizado, instrumentos e registros comportamentais. A entrevista deve investigar motivo da procura, queixa, início, frequência, intensidade e duração do problema, situações em que ocorre e em que não ocorre, consequências, tentativas anteriores de solução e fatores de risco e proteção. A observação deve ser descrita tecnicamente: em lugar de “paciente estava estranho”, registram-se a redução do contato visual, a diminuição do volume da voz e a mudança de assunto diante de determinado tema. A identificação deve ser codificada, e a história de vida entra apenas na medida em que contribua para a compreensão do caso, jamais como biografia.</w:t>
-      </w:r>
-    </w:p>
-    <w:p>
-      <w:pPr>
-        <w:spacing w:after="0" w:line="360"/>
-        <w:ind w:firstLine="708"/>
-        <w:jc w:val="both"/>
-      </w:pPr>
-      <w:r>
-        <w:rPr>
-          <w:rFonts w:ascii="Times New Roman" w:cs="Times New Roman" w:eastAsia="Times New Roman" w:hAnsi="Times New Roman"/>
-          <w:sz w:val="24"/>
-          <w:szCs w:val="24"/>
-        </w:rPr>
-        <w:t xml:space="preserve">A análise organiza-se em torno da análise funcional, no modelo antecedentes–resposta–consequências, ampliado pelas operações estabelecedoras e pelos efeitos futuros. Conduzido o caso pela terapia cognitivo-comportamental, acrescenta-se a conceitualização de situação, pensamentos automáticos, emoções, comportamentos, consequências e crenças intermediárias e centrais, podendo-se recorrer ao modelo ABC. O manual insiste em que tais crenças “não devem ser simplesmente atribuídas ao paciente”, mas construídas a partir da avaliação (Manual…, 2026). A organização completa-se com a distinção entre fatores predisponentes, precipitantes, mantenedores e de proteção e com o levantamento de recursos e obstáculos, itens assumidos de Freire, Sousa e Hessel (2024), cujo modelo prevê, na hipótese compreensiva, precipitantes, origem, recursos, obstáculos e hipótese central.</w:t>
-      </w:r>
-    </w:p>
-    <w:p>
-      <w:pPr>
-        <w:spacing w:after="0" w:line="360"/>
-        <w:ind w:firstLine="708"/>
-        <w:jc w:val="both"/>
-      </w:pPr>
-      <w:r>
-        <w:rPr>
-          <w:rFonts w:ascii="Times New Roman" w:cs="Times New Roman" w:eastAsia="Times New Roman" w:hAnsi="Times New Roman"/>
-          <w:sz w:val="24"/>
-          <w:szCs w:val="24"/>
-        </w:rPr>
-        <w:t xml:space="preserve">A hipótese clínica deve responder qual explicação, sustentada pelos dados disponíveis, melhor organiza o funcionamento apresentado, sem se apresentar como verdade absoluta. Dela derivam os objetivos de curto, médio e longo prazo — organização também tomada de Freire, Sousa e Hessel (2024) — e as intervenções, cada qual devendo responder por que é indicada para aquele paciente. O manual opõe a listagem de técnicas, como em “foram utilizadas técnicas de respiração, reestruturação cognitiva, exposição e relaxamento”, à justificativa que vincula a exposição gradual à hipótese de que a esquiva mantém o quadro (Manual…, 2026). A técnica subordina-se à formulação, e não o contrário.</w:t>
-      </w:r>
-    </w:p>
-    <w:p>
-      <w:pPr>
-        <w:spacing w:after="0" w:line="360"/>
-        <w:ind w:firstLine="708"/>
-        <w:jc w:val="both"/>
-      </w:pPr>
-      <w:r>
-        <w:rPr>
-          <w:rFonts w:ascii="Times New Roman" w:cs="Times New Roman" w:eastAsia="Times New Roman" w:hAnsi="Times New Roman"/>
-          <w:sz w:val="24"/>
-          <w:szCs w:val="24"/>
-        </w:rPr>
-        <w:t xml:space="preserve">O monitoramento exige evidências de mudança — frequência, intensidade, duração, ampliação de repertório — e, quando possível, comparação de medidas antes e depois. Aqui se situa a advertência metodológica mais importante do manual: a sucessão temporal entre intervenção e melhora não autoriza inferência causal, razão pela qual se recomendam expressões como “após a intervenção, observou-se” ou “os dados sugerem”, vetando-se “a técnica curou o paciente”. A ressalva coincide com o IBAC (2024), que aponta como limitações do relato de caso a tendência a atribuir causalidade à intervenção que precede a melhora e a baixa generalização, sem que isso anule seu valor didático e heurístico.</w:t>
-      </w:r>
-    </w:p>
-    <w:p>
-      <w:pPr>
-        <w:spacing w:after="0" w:line="360"/>
-        <w:ind w:firstLine="708"/>
-        <w:jc w:val="both"/>
-      </w:pPr>
-      <w:r>
-        <w:rPr>
-          <w:rFonts w:ascii="Times New Roman" w:cs="Times New Roman" w:eastAsia="Times New Roman" w:hAnsi="Times New Roman"/>
-          <w:sz w:val="24"/>
-          <w:szCs w:val="24"/>
-        </w:rPr>
-        <w:t xml:space="preserve">No plano ético e documental, a Resolução CFP nº 001/2009 torna obrigatório o registro decorrente da prestação de serviços psicológicos e determina, em seu artigo 3º, que “em caso de serviço psicológico prestado em serviços-escola e campos de estágio, o registro deve contemplar a identificação e a assinatura do responsável técnico/supervisor que responderá pelo serviço prestado, bem como do estagiário” (Conselho Federal de Psicologia, 2009). O Manual orientativo do CFP acrescenta que todo registro psicológico é material de natureza sigilosa, com restrição de acesso a terceiros, cabendo à profissional “construir um raciocínio clínico que a conduza no sentido de avaliar quais intervenções, procedimentos e observações devam ser registradas” (Conselho Federal de Psicologia, 2025). Note-se que tais normas regem o registro do serviço, não a produção acadêmica: o estudo de caso as pressupõe, mas delas se distingue quanto à finalidade e ao destinatário.</w:t>
-      </w:r>
-    </w:p>
-    <w:p>
-      <w:pPr>
-        <w:spacing w:after="0" w:line="360"/>
-        <w:ind w:firstLine="708"/>
-        <w:jc w:val="both"/>
-      </w:pPr>
-      <w:r>
-        <w:rPr>
-          <w:rFonts w:ascii="Times New Roman" w:cs="Times New Roman" w:eastAsia="Times New Roman" w:hAnsi="Times New Roman"/>
-          <w:sz w:val="24"/>
-          <w:szCs w:val="24"/>
-        </w:rPr>
-        <w:t xml:space="preserve">Algumas reservas, contudo, merecem registro. A primeira diz respeito à transposição do modelo de Freire, Sousa e Hessel (2024). Os autores adaptaram às psicoterapias existenciais o instrumento de Eells (2015 apud Freire; Sousa; Hessel, 2024) e, ao fazê-lo, substituíram deliberadamente “hipóteses explanatórias” por “hipóteses compreensivas”, “diante das diversas críticas da incompatibilidade da psicopatologia fenomenológica e do pensamento existencial com o termo ‘explanatório’, já que não se pretende estabelecer relações de causalidade como nas ciências naturais” (Freire; Sousa; Hessel, 2024, p. 108). A escolha vocabular é, pois, decisão epistemológica situada, não detalhe de redação. Ao importar a organização do instrumento para uma clínica comportamental, o manual herda um vocabulário construído para recusar justamente o tipo de relação — funcional, entre comportamento e ambiente — que a análise do comportamento pretende estabelecer. A ressalva de que o modelo não é transposto literalmente atenua o problema, mas convém explicitar, no estudo de caso, que “hipótese” designa ali uma relação funcional sustentada por dados, e não uma compreensão de sentido.</w:t>
-      </w:r>
-    </w:p>
-    <w:p>
-      <w:pPr>
-        <w:spacing w:after="0" w:line="360"/>
-        <w:ind w:firstLine="708"/>
-        <w:jc w:val="both"/>
-      </w:pPr>
-      <w:r>
-        <w:rPr>
-          <w:rFonts w:ascii="Times New Roman" w:cs="Times New Roman" w:eastAsia="Times New Roman" w:hAnsi="Times New Roman"/>
-          <w:sz w:val="24"/>
-          <w:szCs w:val="24"/>
-        </w:rPr>
-        <w:t xml:space="preserve">A segunda reserva é de outra ordem. Se o manual e Canguçu (2021) convergem ao recusar o protocolo, divergem quanto ao estatuto do texto: a autora sustenta, na trilha de Lacan, que a escrita do caso possui “estrutura de ficção” e a concebe como gênero literário, ao passo que o manual exige descrição operacional e observável. A tensão é real e não deve ser dissolvida, mas há entre ambos um ponto de contato pouco explorado. Canguçu (2021, p. 26) lembra que “as desejáveis distorções, encobrimentos e alterações necessárias para proteger o sigilo clínico pertencem ao método de tratamento”, chegando a relatar que condensou elementos de casos semelhantes na construção de um caso único — o que oferece fundamento teórico, e não apenas normativo, à identificação codificada que o manual prescreve. Registre-se, por fim, uma lacuna: ao advertir contra a inferência causal, o manual não menciona os delineamentos de caso único, embora Leonardi e Meyer (2015, p. 1148) registrem que a American Psychological Association “referenda diferentes tipos de métodos nomotéticos e idiográficos (ensaios clínicos randomizados, experimentos de caso único, estudos de caso)”. Indicar essa possibilidade permitiria compreender que a fragilidade inferencial não é atributo do caso único em si, mas do delineamento descritivo adotado, convertendo uma limitação a declarar em um problema de método a enfrentar.</w:t>
-      </w:r>
-    </w:p>
-    <w:p>
-      <w:pPr>
-        <w:spacing w:after="0" w:line="360"/>
-        <w:ind w:firstLine="708"/>
-        <w:jc w:val="both"/>
-      </w:pPr>
-      <w:r>
-        <w:rPr>
-          <w:rFonts w:ascii="Times New Roman" w:cs="Times New Roman" w:eastAsia="Times New Roman" w:hAnsi="Times New Roman"/>
-          <w:sz w:val="24"/>
-          <w:szCs w:val="24"/>
-        </w:rPr>
-        <w:t xml:space="preserve">Resta, como critério de autoavaliação, a pergunta com que o manual encerra a discussão sobre a qualidade da formulação: se outro profissional qualificado lesse o texto, compreenderia por que determinada intervenção foi escolhida? Enquanto a resposta for negativa, a formulação ainda não está pronta.</w:t>
-      </w:r>
-    </w:p>
-    <w:p>
-      <w:pPr>
-        <w:spacing w:after="240" w:before="360" w:line="360"/>
-        <w:jc w:val="left"/>
-      </w:pPr>
-      <w:r>
-        <w:rPr>
-          <w:rFonts w:ascii="Times New Roman" w:cs="Times New Roman" w:eastAsia="Times New Roman" w:hAnsi="Times New Roman"/>
-          <w:b/>
-          <w:bCs/>
-          <w:sz w:val="24"/>
-          <w:szCs w:val="24"/>
-        </w:rPr>
-        <w:t xml:space="preserve">Referências</w:t>
+        <w:t xml:space="preserve">CANGUÇU, Daniela. Escrever a clínica / construir o caso: o que se inscreve numa análise? </w:t>
+      </w:r>
+      <w:r>
+        <w:rPr>
+          <w:rFonts w:ascii="Times New Roman" w:cs="Times New Roman" w:eastAsia="Times New Roman" w:hAnsi="Times New Roman"/>
+          <w:i/>
+          <w:iCs/>
+          <w:sz w:val="24"/>
+          <w:szCs w:val="24"/>
+        </w:rPr>
+        <w:t xml:space="preserve">Ágora: Estudos em Teoria Psicanalítica</w:t>
+      </w:r>
+      <w:r>
+        <w:rPr>
+          <w:rFonts w:ascii="Times New Roman" w:cs="Times New Roman" w:eastAsia="Times New Roman" w:hAnsi="Times New Roman"/>
+          <w:sz w:val="24"/>
+          <w:szCs w:val="24"/>
+        </w:rPr>
+        <w:t xml:space="preserve">, Rio de Janeiro, v. 24, n. 1, p. 19-27, jan./abr. 2021. DOI: 10.1590/1809-44142021001003.</w:t>
       </w:r>
     </w:p>
     <w:p>
@@ -256,7 +287,7 @@
           <w:sz w:val="24"/>
           <w:szCs w:val="24"/>
         </w:rPr>
-        <w:t xml:space="preserve">CANGUÇU, Daniela. Escrever a clínica / construir o caso: o que se inscreve numa análise? </w:t>
+        <w:t xml:space="preserve">CONSELHO FEDERAL DE PSICOLOGIA. </w:t>
       </w:r>
       <w:r>
         <w:rPr>
@@ -266,15 +297,15 @@
           <w:sz w:val="24"/>
           <w:szCs w:val="24"/>
         </w:rPr>
-        <w:t xml:space="preserve">Ágora: Estudos em Teoria Psicanalítica</w:t>
-      </w:r>
-      <w:r>
-        <w:rPr>
-          <w:rFonts w:ascii="Times New Roman" w:cs="Times New Roman" w:eastAsia="Times New Roman" w:hAnsi="Times New Roman"/>
-          <w:sz w:val="24"/>
-          <w:szCs w:val="24"/>
-        </w:rPr>
-        <w:t xml:space="preserve">, Rio de Janeiro, v. 24, n. 1, p. 19-27, jan./abr. 2021. DOI: 10.1590/1809-44142021001003.</w:t>
+        <w:t xml:space="preserve">Manual orientativo de registro e elaboração de documentos psicológicos</w:t>
+      </w:r>
+      <w:r>
+        <w:rPr>
+          <w:rFonts w:ascii="Times New Roman" w:cs="Times New Roman" w:eastAsia="Times New Roman" w:hAnsi="Times New Roman"/>
+          <w:sz w:val="24"/>
+          <w:szCs w:val="24"/>
+        </w:rPr>
+        <w:t xml:space="preserve">. 1. ed. Brasília, DF: CFP, 2025.</w:t>
       </w:r>
     </w:p>
     <w:p>
@@ -298,15 +329,15 @@
           <w:sz w:val="24"/>
           <w:szCs w:val="24"/>
         </w:rPr>
-        <w:t xml:space="preserve">Manual orientativo de registro e elaboração de documentos psicológicos</w:t>
-      </w:r>
-      <w:r>
-        <w:rPr>
-          <w:rFonts w:ascii="Times New Roman" w:cs="Times New Roman" w:eastAsia="Times New Roman" w:hAnsi="Times New Roman"/>
-          <w:sz w:val="24"/>
-          <w:szCs w:val="24"/>
-        </w:rPr>
-        <w:t xml:space="preserve">. 1. ed. Brasília, DF: CFP, 2025.</w:t>
+        <w:t xml:space="preserve">Resolução CFP nº 001/2009, de 30 de março de 2009</w:t>
+      </w:r>
+      <w:r>
+        <w:rPr>
+          <w:rFonts w:ascii="Times New Roman" w:cs="Times New Roman" w:eastAsia="Times New Roman" w:hAnsi="Times New Roman"/>
+          <w:sz w:val="24"/>
+          <w:szCs w:val="24"/>
+        </w:rPr>
+        <w:t xml:space="preserve">. Dispõe sobre a obrigatoriedade do registro documental decorrente da prestação de serviços psicológicos. Brasília, DF: CFP, 2009.</w:t>
       </w:r>
     </w:p>
     <w:p>
@@ -320,7 +351,7 @@
           <w:sz w:val="24"/>
           <w:szCs w:val="24"/>
         </w:rPr>
-        <w:t xml:space="preserve">CONSELHO FEDERAL DE PSICOLOGIA. </w:t>
+        <w:t xml:space="preserve">FREIRE, Klessyo do Espirito Santo; SOUSA, Adria de Lima; HESSEL, Beatriz Ribeiro Cortez Cardozo Barata de Almeida. Adaptação de um modelo de formulação de caso clínico para as psicoterapias existenciais. </w:t>
       </w:r>
       <w:r>
         <w:rPr>
@@ -330,15 +361,15 @@
           <w:sz w:val="24"/>
           <w:szCs w:val="24"/>
         </w:rPr>
-        <w:t xml:space="preserve">Resolução CFP nº 001/2009, de 30 de março de 2009</w:t>
-      </w:r>
-      <w:r>
-        <w:rPr>
-          <w:rFonts w:ascii="Times New Roman" w:cs="Times New Roman" w:eastAsia="Times New Roman" w:hAnsi="Times New Roman"/>
-          <w:sz w:val="24"/>
-          <w:szCs w:val="24"/>
-        </w:rPr>
-        <w:t xml:space="preserve">. Dispõe sobre a obrigatoriedade do registro documental decorrente da prestação de serviços psicológicos. Brasília, DF: CFP, 2009.</w:t>
+        <w:t xml:space="preserve">Psicopatologia Fenomenológica Contemporânea</w:t>
+      </w:r>
+      <w:r>
+        <w:rPr>
+          <w:rFonts w:ascii="Times New Roman" w:cs="Times New Roman" w:eastAsia="Times New Roman" w:hAnsi="Times New Roman"/>
+          <w:sz w:val="24"/>
+          <w:szCs w:val="24"/>
+        </w:rPr>
+        <w:t xml:space="preserve">, v. 13, n. 1, p. 88-116, 2024. DOI: 10.37067/rpfc.v13i1.1151.</w:t>
       </w:r>
     </w:p>
     <w:p>
@@ -352,7 +383,7 @@
           <w:sz w:val="24"/>
           <w:szCs w:val="24"/>
         </w:rPr>
-        <w:t xml:space="preserve">FREIRE, Klessyo do Espirito Santo; SOUSA, Adria de Lima; HESSEL, Beatriz Ribeiro Cortez Cardozo Barata de Almeida. Adaptação de um modelo de formulação de caso clínico para as psicoterapias existenciais. </w:t>
+        <w:t xml:space="preserve">INSTITUTO BRASILIENSE DE ANÁLISE DO COMPORTAMENTO. </w:t>
       </w:r>
       <w:r>
         <w:rPr>
@@ -362,15 +393,15 @@
           <w:sz w:val="24"/>
           <w:szCs w:val="24"/>
         </w:rPr>
-        <w:t xml:space="preserve">Psicopatologia Fenomenológica Contemporânea</w:t>
-      </w:r>
-      <w:r>
-        <w:rPr>
-          <w:rFonts w:ascii="Times New Roman" w:cs="Times New Roman" w:eastAsia="Times New Roman" w:hAnsi="Times New Roman"/>
-          <w:sz w:val="24"/>
-          <w:szCs w:val="24"/>
-        </w:rPr>
-        <w:t xml:space="preserve">, v. 13, n. 1, p. 88-116, 2024. DOI: 10.37067/rpfc.v13i1.1151.</w:t>
+        <w:t xml:space="preserve">Estudo de caso: não é de se jogar fora</w:t>
+      </w:r>
+      <w:r>
+        <w:rPr>
+          <w:rFonts w:ascii="Times New Roman" w:cs="Times New Roman" w:eastAsia="Times New Roman" w:hAnsi="Times New Roman"/>
+          <w:sz w:val="24"/>
+          <w:szCs w:val="24"/>
+        </w:rPr>
+        <w:t xml:space="preserve">. Brasília, DF: IBAC, 2024. Disponível em: https://ibac.com.br/estudo-de-caso-nao-e-de-se-jogar-fora/. Acesso em: 31 ago. 2026.</w:t>
       </w:r>
     </w:p>
     <w:p>
@@ -384,7 +415,7 @@
           <w:sz w:val="24"/>
           <w:szCs w:val="24"/>
         </w:rPr>
-        <w:t xml:space="preserve">INSTITUTO BRASILIENSE DE ANÁLISE DO COMPORTAMENTO. </w:t>
+        <w:t xml:space="preserve">LEONARDI, Jan Luiz; MEYER, Sonia Beatriz. Prática baseada em evidências em Psicologia e a história da busca pelas provas empíricas da eficácia das psicoterapias. </w:t>
       </w:r>
       <w:r>
         <w:rPr>
@@ -394,38 +425,6 @@
           <w:sz w:val="24"/>
           <w:szCs w:val="24"/>
         </w:rPr>
-        <w:t xml:space="preserve">Estudo de caso: não é de se jogar fora</w:t>
-      </w:r>
-      <w:r>
-        <w:rPr>
-          <w:rFonts w:ascii="Times New Roman" w:cs="Times New Roman" w:eastAsia="Times New Roman" w:hAnsi="Times New Roman"/>
-          <w:sz w:val="24"/>
-          <w:szCs w:val="24"/>
-        </w:rPr>
-        <w:t xml:space="preserve">. Brasília, DF: IBAC, 2024. Disponível em: https://ibac.com.br/estudo-de-caso-nao-e-de-se-jogar-fora/. Acesso em: 31 ago. 2026.</w:t>
-      </w:r>
-    </w:p>
-    <w:p>
-      <w:pPr>
-        <w:spacing w:after="240" w:line="240"/>
-        <w:jc w:val="left"/>
-      </w:pPr>
-      <w:r>
-        <w:rPr>
-          <w:rFonts w:ascii="Times New Roman" w:cs="Times New Roman" w:eastAsia="Times New Roman" w:hAnsi="Times New Roman"/>
-          <w:sz w:val="24"/>
-          <w:szCs w:val="24"/>
-        </w:rPr>
-        <w:t xml:space="preserve">LEONARDI, Jan Luiz; MEYER, Sonia Beatriz. Prática baseada em evidências em Psicologia e a história da busca pelas provas empíricas da eficácia das psicoterapias. </w:t>
-      </w:r>
-      <w:r>
-        <w:rPr>
-          <w:rFonts w:ascii="Times New Roman" w:cs="Times New Roman" w:eastAsia="Times New Roman" w:hAnsi="Times New Roman"/>
-          <w:i/>
-          <w:iCs/>
-          <w:sz w:val="24"/>
-          <w:szCs w:val="24"/>
-        </w:rPr>
         <w:t xml:space="preserve">Psicologia: Ciência e Profissão</w:t>
       </w:r>
       <w:r>
@@ -435,20 +434,6 @@
           <w:szCs w:val="24"/>
         </w:rPr>
         <w:t xml:space="preserve">, v. 35, n. 4, p. 1139-1156, 2015. DOI: 10.1590/1982-3703001552014.</w:t>
-      </w:r>
-    </w:p>
-    <w:p>
-      <w:pPr>
-        <w:spacing w:after="240" w:line="240"/>
-        <w:jc w:val="left"/>
-      </w:pPr>
-      <w:r>
-        <w:rPr>
-          <w:rFonts w:ascii="Times New Roman" w:cs="Times New Roman" w:eastAsia="Times New Roman" w:hAnsi="Times New Roman"/>
-          <w:sz w:val="24"/>
-          <w:szCs w:val="24"/>
-        </w:rPr>
-        <w:t xml:space="preserve">MANUAL para construção de estudo de caso clínico na clínica-escola: abordagens comportamentais e cognitivo-comportamentais. [S. l.: s. n.], 2026. Material didático não publicado.</w:t>
       </w:r>
     </w:p>
     <w:sectPr>

</xml_diff>

<commit_message>
Reescreve fichamento com camada de TCC e linha de raciocinio unica
Integra Neufeld e Cavenage (2010), que cobre a formulacao de caso
especifica da TCC: definicao de conceitualizacao cognitiva, as seis
etapas de sistematizacao e a critica interna de Bieling e Kuyken sobre
confiabilidade descritiva versus inferencial.

Texto reduzido para cerca de 2 paginas e reorganizado em torno de uma
tese unica: o estudo de caso vale pelo que torna reconstruivel. Cada
paragrafo avanca esse argumento ate seus limites metodologicos.

Beck, Bieling e Kuyken, Persons e Range entram por citacao de citacao
(apud), ja que nao houve acesso as obras originais.

Co-Authored-By: Claude Opus 5 <noreply@anthropic.com>
Claude-Session: https://claude.ai/code/session_017Djp27eCPHXbKSnZ5tsU66
</commit_message>
<xml_diff>
--- a/fichamento/Fichamento_Estudo_de_Caso.docx
+++ b/fichamento/Fichamento_Estudo_de_Caso.docx
@@ -15,7 +15,7 @@
           <w:sz w:val="24"/>
           <w:szCs w:val="24"/>
         </w:rPr>
-        <w:t xml:space="preserve">FICHAMENTO — COMO ELABORAR UM ESTUDO DE CASO CLÍNICO NAS ABORDAGENS COMPORTAMENTAIS E COGNITIVO-COMPORTAMENTAIS</w:t>
+        <w:t xml:space="preserve">FICHAMENTO — O ESTUDO DE CASO CLÍNICO NA TERAPIA COGNITIVO-COMPORTAMENTAL: O QUE É E COMO SE CONSTRÓI</w:t>
       </w:r>
     </w:p>
     <w:p>
@@ -30,7 +30,7 @@
           <w:sz w:val="24"/>
           <w:szCs w:val="24"/>
         </w:rPr>
-        <w:t xml:space="preserve">O roteiro oferecido pela supervisão começa por uma distinção que vale reter: prontuário, registro de sessão, formulação e estudo de caso não são a mesma coisa. O prontuário acompanha a prestação do serviço e cumpre função técnica e legal. O registro de sessão é o relato sintético de um atendimento. A formulação organiza as informações para orientar decisões clínicas. Já o estudo de caso é produção acadêmica, e articula dados, teoria, hipóteses, intervenção e evolução preservando o sigilo. Copiar o prontuário não produz um estudo de caso.</w:t>
+        <w:t xml:space="preserve">O estudo de caso é a investigação detalhada de um caso único, seja uma pessoa, um grupo ou uma situação, construída a partir de observação clínica, entrevistas, questionários, testes e registros como o prontuário (IBAC, 2024). Seu valor na formação não está no volume de informação reunida, mas em tornar visível o percurso do raciocínio: o que o clínico observou, como isso levou à interpretação do caso e como se chegou às intervenções escolhidas. Um caso bem escrito é aquele cujo raciocínio o leitor consegue refazer, e essa exigência organiza tudo o mais.</w:t>
       </w:r>
     </w:p>
     <w:p>
@@ -45,7 +45,7 @@
           <w:sz w:val="24"/>
           <w:szCs w:val="24"/>
         </w:rPr>
-        <w:t xml:space="preserve">Essa exigência não é idiossincrasia das abordagens comportamentais. Canguçu (2021, p. 20) chega ao mesmo lugar pela psicanálise, ao afirmar que construir um caso “não consiste em descrições protocolares nem se reduz a registros de prontuários”. E vai além: “ter um paciente não é o mesmo que ter um caso clínico – por isso, o caso precisa necessariamente ser construído”. Que dois campos tão distantes convirjam nesse ponto sugere que é a elaboração, e não a transcrição, o que define o gênero.</w:t>
+        <w:t xml:space="preserve">A primeira consequência é que copiar o prontuário não produz um estudo de caso. Canguçu (2021, p. 20) afirma que construir um caso “não consiste em descrições protocolares nem se reduz a registros de prontuários”, e condensa a diferença numa frase: “ter um paciente não é o mesmo que ter um caso clínico – por isso, o caso precisa necessariamente ser construído”. Escrever o caso é um segundo trabalho, distinto de atender.</w:t>
       </w:r>
     </w:p>
     <w:p>
@@ -60,7 +60,7 @@
           <w:sz w:val="24"/>
           <w:szCs w:val="24"/>
         </w:rPr>
-        <w:t xml:space="preserve">O princípio que sustenta todo o restante é fácil de enunciar e difícil de cumprir: os dados vêm antes da hipótese. Primeiro se coleta e se observa, depois se identificam padrões, e só então se formulam hipóteses, objetivos e intervenções, que passam a ser monitorados. O erro mais frequente é o percurso inverso, começar pela teoria e encaixar o paciente nela. Dizer que o paciente é ansioso porque tem baixa autoestima apresenta uma conclusão sem mostrar como se chegou até ela. Descrever que, diante de situações de exposição social, ele antecipa consequências negativas, esquiva-se e sente alívio logo depois é outra coisa, porque a formulação continua presa ao que foi observado.</w:t>
+        <w:t xml:space="preserve">O que torna esse raciocínio reconstruível é uma formulação explícita, isto é, o processo de desenvolver hipóteses e planos terapêuticos sobre as causas, os precipitantes e os mecanismos que mantêm os problemas do paciente (Freire; Sousa; Hessel, 2024). Na terapia cognitivo-comportamental a tarefa se chama conceitualização cognitiva e funciona, segundo Beck (1997 apud Neufeld; Cavenage, 2010, p. 7), como “um mapa que orienta o trabalho a ser realizado com o cliente”. Sem mapa, ninguém refaz o percurso. Neufeld e Cavenage (2010, p. 9) são diretas quanto ao custo de dispensá-lo: “sem a compreensão cognitiva do cliente, todo o tratamento se resumirá à aplicação de várias técnicas cognitivas e comportamentais, que não resultarão em um trabalho eficaz”.</w:t>
       </w:r>
     </w:p>
     <w:p>
@@ -75,22 +75,7 @@
           <w:sz w:val="24"/>
           <w:szCs w:val="24"/>
         </w:rPr>
-        <w:t xml:space="preserve">Daí vem a exigência de operacionalizar. “É inseguro” e “é resistente” não descrevem comportamento algum. Pedir confirmação a todo momento, reler mensagens várias vezes antes de enviar, largar a tarefa ao primeiro sinal de erro: isso é observável, e é isso que entra no texto. A exigência não é preciosismo metodológico. Leonardi e Meyer (2015, p. 1148) lembram que a intuição clínica</w:t>
-      </w:r>
-    </w:p>
-    <w:p>
-      <w:pPr>
-        <w:spacing w:after="240" w:before="240" w:line="240"/>
-        <w:ind w:left="2268"/>
-        <w:jc w:val="both"/>
-      </w:pPr>
-      <w:r>
-        <w:rPr>
-          <w:rFonts w:ascii="Times New Roman" w:cs="Times New Roman" w:eastAsia="Times New Roman" w:hAnsi="Times New Roman"/>
-          <w:sz w:val="22"/>
-          <w:szCs w:val="22"/>
-        </w:rPr>
-        <w:t xml:space="preserve">costuma estar repleta de vieses, falhas e distorções, a ponto de o terapeuta enxergar sucesso quando há indícios de fracasso. […] a perícia clínica é concebida como um conjunto rigoroso de competências que complementa (e não rivaliza com) a melhor evidência disponível.</w:t>
+        <w:t xml:space="preserve">A construção segue etapas. Neufeld e Cavenage (2010) propõem seis, voltadas a terapeutas iniciantes: psicoeducação sobre o modelo cognitivo, antes de qualquer conceitualização; levantamento de situações, pensamentos automáticos, emoções, reações fisiológicas e comportamentos do cotidiano; registro desses dados no diagrama de conceitualização; identificação do significado dos pensamentos automáticos; identificação das crenças centrais, das intermediárias e das estratégias compensatórias; e sedimentação da natureza cíclica do sistema de crenças, com o traçado de metas. O modelo de Freire, Sousa e Hessel (2024), vindo de outra tradição, percorre a mesma lógica em sete itens, da identificação e da história clínica à lista de problemas, à hipótese compreensiva — precipitantes, origem, recursos, obstáculos e hipótese central — e aos objetivos de curto, médio e longo prazo. Em ambos o caminho é idêntico: dados primeiro, padrões depois, hipótese em seguida, plano por último.</w:t>
       </w:r>
     </w:p>
     <w:p>
@@ -105,7 +90,7 @@
           <w:sz w:val="24"/>
           <w:szCs w:val="24"/>
         </w:rPr>
-        <w:t xml:space="preserve">As informações vêm da entrevista, da observação e, quando há indicação técnica e autorização, de instrumentos e registros comportamentais. Na entrevista interessa saber quando o problema começou, com que frequência e intensidade aparece, em que situações ocorre e, igualmente importante, em que situações não ocorre, o que acontece depois e o que já foi tentado antes. A observação pede o mesmo rigor: “paciente estava estranho” não informa nada, ao passo que registrar a redução do contato visual e a mudança de assunto quando certo tema aparece informa bastante. A identificação é codificada, e a história de vida entra apenas na medida em que ajude a entender o caso, nunca como biografia.</w:t>
+        <w:t xml:space="preserve">Nada disso protege sozinho contra a formulação inventada, e daí três salvaguardas. A colaboração: Neufeld e Cavenage (2010, p. 24) advertem que “não se deve apresentar o cliente para ele mesmo, como se o terapeuta soubesse tudo a seu respeito”, e recomendam que o próprio cliente preencha o diagrama em sessão. A supervisão, condição para adquirir a habilidade antes da prática efetiva. E a desconfiança da intuição, que segundo Leonardi e Meyer (2015, p. 1148) “costuma estar repleta de vieses, falhas e distorções, a ponto de o terapeuta enxergar sucesso quando há indícios de fracasso”.</w:t>
       </w:r>
     </w:p>
     <w:p>
@@ -120,7 +105,7 @@
           <w:sz w:val="24"/>
           <w:szCs w:val="24"/>
         </w:rPr>
-        <w:t xml:space="preserve">O eixo da análise é funcional: antecedentes, resposta e consequências, com atenção às operações estabelecedoras e aos efeitos de longo prazo. Na terapia cognitivo-comportamental, acrescenta-se a leitura da situação, dos pensamentos automáticos, das emoções, dos comportamentos e das crenças intermediárias e centrais, com o modelo ABC como recurso de organização. Vale insistir num ponto: crenças não se atribuem ao paciente por dedução teórica, constroem-se a partir do que a avaliação mostrou. A organização se fecha separando fatores predisponentes, precipitantes, mantenedores e de proteção e levantando recursos e obstáculos, itens vindos de Freire, Sousa e Hessel (2024).</w:t>
+        <w:t xml:space="preserve">Reconstruir um raciocínio exige que os dados existam por escrito. A Resolução CFP nº 001/2009 fixa o conteúdo mínimo do registro: identificação, avaliação da demanda e definição dos objetivos, evolução do trabalho e procedimentos adotados, encaminhamento ou encerramento. Para o estágio, o artigo 3º exige que conste “a identificação e a assinatura do responsável técnico/supervisor que responderá pelo serviço prestado, bem como do estagiário” (Conselho Federal de Psicologia, 2009), e o Manual orientativo acrescenta que todo registro é sigiloso (Conselho Federal de Psicologia, 2025). Essas normas regem o serviço, não o trabalho acadêmico, ainda que este dependa daquele.</w:t>
       </w:r>
     </w:p>
     <w:p>
@@ -135,7 +120,7 @@
           <w:sz w:val="24"/>
           <w:szCs w:val="24"/>
         </w:rPr>
-        <w:t xml:space="preserve">A hipótese clínica responde a uma pergunta: qual explicação, sustentada pelos dados de que se dispõe, organiza melhor o que o paciente apresenta? Ela não é verdade estabelecida, é hipótese de trabalho, e deve ser revista quando novos dados aparecerem. Dela saem os objetivos de curto, médio e longo prazo, divisão também tomada daqueles autores, e as intervenções. Cada intervenção precisa responder por que foi escolhida para aquele paciente. Listar respiração, reestruturação cognitiva, exposição e relaxamento não explica nada. Dizer que a exposição gradual foi planejada porque a hipótese é de que a esquiva mantém o quadro, sim. A técnica serve à formulação, nunca o contrário.</w:t>
+        <w:t xml:space="preserve">Resta perguntar até onde esse raciocínio autoriza conclusões, e a resposta é modesta. O IBAC (2024) adverte que a melhora observada depois de uma intervenção não permite concluir que a intervenção a produziu, e que um caso isolado não sustenta afirmações de eficácia para outros pacientes. A crítica mais incômoda vem de dentro da própria terapia cognitivo-comportamental: Bieling e Kuyken (2003 apud Neufeld; Cavenage, 2010, p. 16) concluem que a confiabilidade da conceitualização “pode ser obtida através dos aspectos descritivos do mesmo, mas não com os aspectos inferenciais”, ou seja, descrever o funcionamento é replicável, inferir crenças a partir dele não é. Pesa ainda que Persons et al. (2006 apud Neufeld; Cavenage, 2010) não encontraram diferença de desfecho entre pacientes tratados com e sem ênfase em conceitualização, e que as próprias autoras admitem que “a escassez de pesquisas na área traz dúvidas sobre o valor positivo da conceitualização de caso em TCC” (Neufeld; Cavenage, 2010, p. 30).</w:t>
       </w:r>
     </w:p>
     <w:p>
@@ -150,82 +135,7 @@
           <w:sz w:val="24"/>
           <w:szCs w:val="24"/>
         </w:rPr>
-        <w:t xml:space="preserve">Monitorar significa mostrar mudança: frequência, intensidade, duração, ampliação de repertório e, quando possível, comparação de medidas antes e depois. É aqui que está a advertência metodológica mais importante de todas. Melhora que vem depois da intervenção não prova que a intervenção causou a melhora. Por isso se escreve “após a intervenção, observou-se” ou “os dados sugerem”, e nunca que a técnica curou o paciente. O IBAC (2024) aponta as duas limitações do relato de caso: a tendência a atribuir causalidade ao que veio antes da melhora e a baixa generalização. Nenhuma delas anula seu valor formativo.</w:t>
-      </w:r>
-    </w:p>
-    <w:p>
-      <w:pPr>
-        <w:spacing w:after="0" w:line="360"/>
-        <w:ind w:firstLine="708"/>
-        <w:jc w:val="both"/>
-      </w:pPr>
-      <w:r>
-        <w:rPr>
-          <w:rFonts w:ascii="Times New Roman" w:cs="Times New Roman" w:eastAsia="Times New Roman" w:hAnsi="Times New Roman"/>
-          <w:sz w:val="24"/>
-          <w:szCs w:val="24"/>
-        </w:rPr>
-        <w:t xml:space="preserve">No plano ético, a Resolução CFP nº 001/2009 torna obrigatório o registro decorrente da prestação de serviços psicológicos. Para quem está em estágio, o artigo 3º é o que mais importa, ao determinar que “em caso de serviço psicológico prestado em serviços-escola e campos de estágio, o registro deve contemplar a identificação e a assinatura do responsável técnico/supervisor que responderá pelo serviço prestado, bem como do estagiário” (Conselho Federal de Psicologia, 2009). O Manual orientativo acrescenta que todo registro psicológico é sigiloso e que cabe à profissional “construir um raciocínio clínico que a conduza no sentido de avaliar quais intervenções, procedimentos e observações devam ser registradas” (Conselho Federal de Psicologia, 2025). Uma ressalva se impõe: essas normas regulam o registro do serviço, não o trabalho acadêmico, que tem outra finalidade e outro destinatário.</w:t>
-      </w:r>
-    </w:p>
-    <w:p>
-      <w:pPr>
-        <w:spacing w:after="0" w:line="360"/>
-        <w:ind w:firstLine="708"/>
-        <w:jc w:val="both"/>
-      </w:pPr>
-      <w:r>
-        <w:rPr>
-          <w:rFonts w:ascii="Times New Roman" w:cs="Times New Roman" w:eastAsia="Times New Roman" w:hAnsi="Times New Roman"/>
-          <w:sz w:val="24"/>
-          <w:szCs w:val="24"/>
-        </w:rPr>
-        <w:t xml:space="preserve">Cabem, por fim, duas observações críticas, feitas em favor do roteiro e não contra ele. A primeira diz respeito ao empréstimo tomado a Freire, Sousa e Hessel (2024). Os autores adaptaram para as psicoterapias existenciais o instrumento de Eells (2015 apud Freire; Sousa; Hessel, 2024) e, no caminho, trocaram “hipóteses explanatórias” por “hipóteses compreensivas”. A troca foi deliberada, e eles explicam por quê: “diante das diversas críticas da incompatibilidade da psicopatologia fenomenológica e do pensamento existencial com o termo ‘explanatório’, já que não se pretende estabelecer relações de causalidade como nas ciências naturais” (Freire; Sousa; Hessel, 2024, p. 108). A palavra carrega uma posição epistemológica, não é escolha de estilo. Trazida para uma clínica comportamental, essa organização traz junto um vocabulário criado justamente para recusar o tipo de relação que a análise do comportamento quer estabelecer, a relação funcional entre comportamento e ambiente. A supervisão já sinaliza que não transpõe o modelo ao pé da letra, o que resolve boa parte do problema. Ainda assim, parece prudente deixar explícito, no estudo de caso, que “hipótese” ali significa relação funcional sustentada por dados, e não compreensão de sentido.</w:t>
-      </w:r>
-    </w:p>
-    <w:p>
-      <w:pPr>
-        <w:spacing w:after="0" w:line="360"/>
-        <w:ind w:firstLine="708"/>
-        <w:jc w:val="both"/>
-      </w:pPr>
-      <w:r>
-        <w:rPr>
-          <w:rFonts w:ascii="Times New Roman" w:cs="Times New Roman" w:eastAsia="Times New Roman" w:hAnsi="Times New Roman"/>
-          <w:sz w:val="24"/>
-          <w:szCs w:val="24"/>
-        </w:rPr>
-        <w:t xml:space="preserve">A segunda é de outra natureza. O roteiro e Canguçu (2021) concordam em recusar o protocolo, mas discordam sobre o que é o texto do caso. Ela sustenta, seguindo Lacan, que a escrita do caso tem “estrutura de ficção” e a trata como gênero literário, enquanto o roteiro pede descrição operacional. A divergência é real e não vale fingir que não exista. Há, porém, um ponto de encontro que costuma passar despercebido: Canguçu (2021, p. 26) observa que “as desejáveis distorções, encobrimentos e alterações necessárias para proteger o sigilo clínico pertencem ao método de tratamento”, e conta que condensou elementos de casos parecidos para construir um caso só. Isso dá à identificação codificada um fundamento teórico, e não apenas normativo.</w:t>
-      </w:r>
-    </w:p>
-    <w:p>
-      <w:pPr>
-        <w:spacing w:after="0" w:line="360"/>
-        <w:ind w:firstLine="708"/>
-        <w:jc w:val="both"/>
-      </w:pPr>
-      <w:r>
-        <w:rPr>
-          <w:rFonts w:ascii="Times New Roman" w:cs="Times New Roman" w:eastAsia="Times New Roman" w:hAnsi="Times New Roman"/>
-          <w:sz w:val="24"/>
-          <w:szCs w:val="24"/>
-        </w:rPr>
-        <w:t xml:space="preserve">Resta uma lacuna. O roteiro acerta ao proibir a inferência causal, mas trata isso como limite fixo do estudo de caso e não menciona os delineamentos de caso único. Leonardi e Meyer (2015, p. 1148) registram que a American Psychological Association “referenda diferentes tipos de métodos nomotéticos e idiográficos (ensaios clínicos randomizados, experimentos de caso único, estudos de caso)”. A fragilidade da inferência não está no caso único, está no delineamento descritivo que se escolheu. O que era uma limitação a declarar passa a ser um problema de método a enfrentar.</w:t>
-      </w:r>
-    </w:p>
-    <w:p>
-      <w:pPr>
-        <w:spacing w:after="0" w:line="360"/>
-        <w:ind w:firstLine="708"/>
-        <w:jc w:val="both"/>
-      </w:pPr>
-      <w:r>
-        <w:rPr>
-          <w:rFonts w:ascii="Times New Roman" w:cs="Times New Roman" w:eastAsia="Times New Roman" w:hAnsi="Times New Roman"/>
-          <w:sz w:val="24"/>
-          <w:szCs w:val="24"/>
-        </w:rPr>
-        <w:t xml:space="preserve">Ao final permanece a pergunta que o próprio roteiro propõe como critério de qualidade: se outro profissional lesse essa formulação, entenderia por que aquela intervenção foi escolhida? Enquanto a resposta for não, o trabalho não terminou.</w:t>
+        <w:t xml:space="preserve">Isso não desqualifica o instrumento, mas define seu estatuto: a formulação vale como organizador do raciocínio, não como prova. E a fragilidade inferencial não está no caso único em si, já que Leonardi e Meyer (2015, p. 1148) registram que a American Psychological Association “referenda diferentes tipos de métodos nomotéticos e idiográficos (ensaios clínicos randomizados, experimentos de caso único, estudos de caso)”, mas no delineamento descritivo que se escolhe. Fecha-se assim o percurso iniciado no começo: se o estudo de caso vale pelo que torna reconstruível, seus critérios de qualidade são os que Rangé (2004 apud Neufeld; Cavenage, 2010, p. 29) enumera — ter utilidade, ser simples, ser teoricamente coerente, explicar comportamentos passados, dar sentido aos presentes e permitir prever os futuros. Um caso que não cumpre isso pode estar bem escrito, mas não ensina nada a quem o lê.</w:t>
       </w:r>
     </w:p>
     <w:p>
@@ -401,7 +311,7 @@
           <w:sz w:val="24"/>
           <w:szCs w:val="24"/>
         </w:rPr>
-        <w:t xml:space="preserve">. Brasília, DF: IBAC, 2024. Disponível em: https://ibac.com.br/estudo-de-caso-nao-e-de-se-jogar-fora/. Acesso em: 31 ago. 2026.</w:t>
+        <w:t xml:space="preserve">. Brasília, DF: IBAC, 2024. Disponível em: https://ibac.com.br/estudo-de-caso-nao-e-de-se-jogar-fora/. Acesso em: 1 set. 2026.</w:t>
       </w:r>
     </w:p>
     <w:p>
@@ -434,6 +344,38 @@
           <w:szCs w:val="24"/>
         </w:rPr>
         <w:t xml:space="preserve">, v. 35, n. 4, p. 1139-1156, 2015. DOI: 10.1590/1982-3703001552014.</w:t>
+      </w:r>
+    </w:p>
+    <w:p>
+      <w:pPr>
+        <w:spacing w:after="240" w:line="240"/>
+        <w:jc w:val="left"/>
+      </w:pPr>
+      <w:r>
+        <w:rPr>
+          <w:rFonts w:ascii="Times New Roman" w:cs="Times New Roman" w:eastAsia="Times New Roman" w:hAnsi="Times New Roman"/>
+          <w:sz w:val="24"/>
+          <w:szCs w:val="24"/>
+        </w:rPr>
+        <w:t xml:space="preserve">NEUFELD, Carmem Beatriz; CAVENAGE, Carla Cristina. Conceitualização cognitiva de caso: uma proposta de sistematização a partir da prática clínica e da formação de terapeutas cognitivo-comportamentais. </w:t>
+      </w:r>
+      <w:r>
+        <w:rPr>
+          <w:rFonts w:ascii="Times New Roman" w:cs="Times New Roman" w:eastAsia="Times New Roman" w:hAnsi="Times New Roman"/>
+          <w:i/>
+          <w:iCs/>
+          <w:sz w:val="24"/>
+          <w:szCs w:val="24"/>
+        </w:rPr>
+        <w:t xml:space="preserve">Revista Brasileira de Terapias Cognitivas</w:t>
+      </w:r>
+      <w:r>
+        <w:rPr>
+          <w:rFonts w:ascii="Times New Roman" w:cs="Times New Roman" w:eastAsia="Times New Roman" w:hAnsi="Times New Roman"/>
+          <w:sz w:val="24"/>
+          <w:szCs w:val="24"/>
+        </w:rPr>
+        <w:t xml:space="preserve">, v. 6, n. 2, p. 3-35, 2010. DOI: 10.5935/1808-5687.20100014.</w:t>
       </w:r>
     </w:p>
     <w:sectPr>

</xml_diff>

<commit_message>
Reescreve o fichamento em registro atribuitivo
Substitui as formulacoes autorais de efeito por conteudo atribuido aos
autores lidos, mantendo a formalidade academica. Incorpora material
antes nao aproveitado das fontes: o empirismo colaborativo de Kuyken,
Padesky e Dudley, a ressalva de Freire, Sousa e Hessel sobre o modelo
como guia, e os seis criterios de Range para avaliar a formulacao.

Elimina travessoes e frases conclusivas de autoria propria.

Co-Authored-By: Claude Opus 5 <noreply@anthropic.com>
Claude-Session: https://claude.ai/code/session_017Djp27eCPHXbKSnZ5tsU66
</commit_message>
<xml_diff>
--- a/fichamento/Fichamento_Estudo_de_Caso.docx
+++ b/fichamento/Fichamento_Estudo_de_Caso.docx
@@ -30,7 +30,7 @@
           <w:sz w:val="24"/>
           <w:szCs w:val="24"/>
         </w:rPr>
-        <w:t xml:space="preserve">O estudo de caso é a investigação detalhada de um caso único, seja uma pessoa, um grupo ou uma situação, construída a partir de observação clínica, entrevistas, questionários, testes e registros como o prontuário (IBAC, 2024). Seu valor na formação não está no volume de informação reunida, mas em tornar visível o percurso do raciocínio clínico. Dito de outro modo: um estudo de caso está bem feito quando outro psicólogo, ao lê-lo, consegue entender por que aquelas hipóteses foram levantadas e por que aquelas intervenções foram escolhidas. É essa exigência que explica cada uma das etapas descritas a seguir.</w:t>
+        <w:t xml:space="preserve">O estudo de caso consiste na investigação detalhada de um caso único, seja uma pessoa, um grupo ou uma situação, e pode recorrer à observação clínica, a entrevistas, a questionários, a testes psicológicos e a registros como o prontuário (IBAC, 2024). Seu valor didático, segundo a mesma fonte, está em permitir que se compreenda quais aspectos do caso foram observados pelo profissional, como conduziram à análise e à interpretação e qual foi o processo de tomada de decisão para definir objetivos e intervenções. É essa exigência de explicitação do raciocínio que organiza as etapas descritas a seguir.</w:t>
       </w:r>
     </w:p>
     <w:p>
@@ -45,7 +45,7 @@
           <w:sz w:val="24"/>
           <w:szCs w:val="24"/>
         </w:rPr>
-        <w:t xml:space="preserve">Se é o raciocínio que precisa ficar visível, copiar o prontuário não produz um estudo de caso, porque o prontuário registra o que aconteceu, e não por que se concluiu o que se concluiu. Canguçu (2021, p. 20) afirma que construir um caso “não consiste em descrições protocolares nem se reduz a registros de prontuários”, e condensa a diferença numa frase: “ter um paciente não é o mesmo que ter um caso clínico – por isso, o caso precisa necessariamente ser construído”. Escrever o caso é um segundo trabalho, distinto de atender.</w:t>
+        <w:t xml:space="preserve">Decorre daí que a transcrição do prontuário não constitui um estudo de caso. Canguçu (2021, p. 20) sustenta que construir um caso “não consiste em descrições protocolares nem se reduz a registros de prontuários”, e distingue as duas operações ao afirmar que “ter um paciente não é o mesmo que ter um caso clínico – por isso, o caso precisa necessariamente ser construído”. A autora trata a escrita do caso como trabalho distinto da condução do tratamento.</w:t>
       </w:r>
     </w:p>
     <w:p>
@@ -60,7 +60,7 @@
           <w:sz w:val="24"/>
           <w:szCs w:val="24"/>
         </w:rPr>
-        <w:t xml:space="preserve">O que torna esse raciocínio reconstruível é uma formulação explícita, isto é, o processo de desenvolver hipóteses e planos terapêuticos sobre as causas, os precipitantes e os mecanismos que mantêm os problemas do paciente (Freire; Sousa; Hessel, 2024). Na terapia cognitivo-comportamental a tarefa se chama conceitualização cognitiva e funciona, segundo Beck (1997 apud Neufeld; Cavenage, 2010, p. 7), como “um mapa que orienta o trabalho a ser realizado com o cliente”. Sem mapa, ninguém refaz o percurso. Neufeld e Cavenage (2010, p. 9) são diretas quanto ao custo de dispensá-lo: “sem a compreensão cognitiva do cliente, todo o tratamento se resumirá à aplicação de várias técnicas cognitivas e comportamentais, que não resultarão em um trabalho eficaz”.</w:t>
+        <w:t xml:space="preserve">A formulação de caso é o instrumento que torna esse raciocínio explícito. Freire, Sousa e Hessel (2024) a definem como o processo de desenvolver hipóteses e planos terapêuticos sobre as causas, os precipitantes e os mecanismos que mantêm os problemas psicológicos do paciente. Na terapia cognitivo-comportamental a tarefa recebe o nome de conceitualização cognitiva e funciona, conforme Beck (1997 apud Neufeld; Cavenage, 2010, p. 7), como “um mapa que orienta o trabalho a ser realizado com o cliente”. Neufeld e Cavenage (2010, p. 9) observam que, sem essa compreensão, “todo o tratamento se resumirá à aplicação de várias técnicas cognitivas e comportamentais, que não resultarão em um trabalho eficaz”.</w:t>
       </w:r>
     </w:p>
     <w:p>
@@ -75,7 +75,7 @@
           <w:sz w:val="24"/>
           <w:szCs w:val="24"/>
         </w:rPr>
-        <w:t xml:space="preserve">A construção segue etapas. Neufeld e Cavenage (2010) propõem seis, voltadas a terapeutas iniciantes: psicoeducação sobre o modelo cognitivo, antes de qualquer conceitualização; levantamento de situações, pensamentos automáticos, emoções, reações fisiológicas e comportamentos do cotidiano; registro desses dados no diagrama de conceitualização; identificação do significado dos pensamentos automáticos; identificação das crenças centrais, das intermediárias e das estratégias compensatórias; e sedimentação da natureza cíclica do sistema de crenças, com o traçado de metas. O modelo de Freire, Sousa e Hessel (2024), vindo de outra tradição, percorre a mesma lógica em sete itens, da identificação e da história clínica à lista de problemas, à hipótese compreensiva — precipitantes, origem, recursos, obstáculos e hipótese central — e aos objetivos de curto, médio e longo prazo. Em ambos o caminho é idêntico: dados primeiro, padrões depois, hipótese em seguida, plano por último.</w:t>
+        <w:t xml:space="preserve">Neufeld e Cavenage (2010) organizam essa construção em seis etapas, dirigidas a terapeutas iniciantes: a psicoeducação sobre o modelo cognitivo, anterior a qualquer conceitualização; o levantamento de situações, pensamentos automáticos, emoções, reações fisiológicas e comportamentos do cotidiano; o registro desses dados no diagrama de conceitualização; a identificação do significado dos pensamentos automáticos; a identificação das crenças centrais, das intermediárias e das estratégias compensatórias; e a sedimentação da natureza cíclica do sistema de crenças, com o traçado de metas. O modelo de Freire, Sousa e Hessel (2024) percorre trajeto semelhante em sete itens, da identificação e da história pessoal e clínica à lista de problemas, à hipótese compreensiva, composta de precipitantes, origem, recursos, obstáculos e hipótese central, e aos objetivos de curto, médio e longo prazo. Em ambas a coleta de dados precede a hipótese, e esta precede o plano de intervenção.</w:t>
       </w:r>
     </w:p>
     <w:p>
@@ -90,7 +90,7 @@
           <w:sz w:val="24"/>
           <w:szCs w:val="24"/>
         </w:rPr>
-        <w:t xml:space="preserve">Nada disso protege sozinho contra a formulação inventada, e daí três salvaguardas. A colaboração: Neufeld e Cavenage (2010, p. 24) advertem que “não se deve apresentar o cliente para ele mesmo, como se o terapeuta soubesse tudo a seu respeito”, e recomendam que o próprio cliente preencha o diagrama em sessão. A supervisão, condição para adquirir a habilidade antes da prática efetiva. E a desconfiança da intuição, que segundo Leonardi e Meyer (2015, p. 1148) “costuma estar repleta de vieses, falhas e distorções, a ponto de o terapeuta enxergar sucesso quando há indícios de fracasso”.</w:t>
+        <w:t xml:space="preserve">Os autores acrescentam condições para que a formulação não se reduza a uma construção do terapeuta. Neufeld e Cavenage (2010, p. 24) advertem que “não se deve apresentar o cliente para ele mesmo, como se o terapeuta soubesse tudo a seu respeito”, e recomendam que seja o próprio cliente a preencher o diagrama em sessão. Kuyken, Padesky e Dudley (2010 apud Neufeld; Cavenage, 2010) situam o empirismo colaborativo entre os princípios da conceitualização, já que as hipóteses de terapeuta e cliente são testadas e adaptadas conforme o retorno das intervenções. Freire, Sousa e Hessel (2024, p. 102) afirmam, de modo convergente, que o modelo “não é fixo e imutável, mas sim um guia a ser utilizado durante o processo clínico”. Leonardi e Meyer (2015, p. 1148) registram que a intuição do terapeuta “costuma estar repleta de vieses, falhas e distorções, a ponto de o terapeuta enxergar sucesso quando há indícios de fracasso”.</w:t>
       </w:r>
     </w:p>
     <w:p>
@@ -105,7 +105,7 @@
           <w:sz w:val="24"/>
           <w:szCs w:val="24"/>
         </w:rPr>
-        <w:t xml:space="preserve">Reconstruir um raciocínio exige que os dados existam por escrito. A Resolução CFP nº 001/2009 fixa o conteúdo mínimo do registro: identificação, avaliação da demanda e definição dos objetivos, evolução do trabalho e procedimentos adotados, encaminhamento ou encerramento. Para o estágio, o artigo 3º exige que conste “a identificação e a assinatura do responsável técnico/supervisor que responderá pelo serviço prestado, bem como do estagiário” (Conselho Federal de Psicologia, 2009), e o Manual orientativo acrescenta que todo registro é sigiloso (Conselho Federal de Psicologia, 2025). Essas normas regem o serviço, não o trabalho acadêmico, ainda que este dependa daquele.</w:t>
+        <w:t xml:space="preserve">O registro documental é a condição material dessa reconstrução. A Resolução CFP nº 001/2009 estabelece o conteúdo mínimo do registro: identificação do usuário, avaliação da demanda e definição dos objetivos, evolução das atividades e procedimentos técnico-científicos adotados, e encaminhamento ou encerramento. Em serviços-escola e campos de estágio, o artigo 3º exige que conste “a identificação e a assinatura do responsável técnico/supervisor que responderá pelo serviço prestado, bem como do estagiário” (Conselho Federal de Psicologia, 2009). O Manual orientativo acrescenta que todo registro psicológico constitui material sigiloso, com restrição de acesso a terceiros (Conselho Federal de Psicologia, 2025). Trata-se, contudo, de normas que regem o serviço, e não a produção acadêmica que dele deriva.</w:t>
       </w:r>
     </w:p>
     <w:p>
@@ -120,7 +120,7 @@
           <w:sz w:val="24"/>
           <w:szCs w:val="24"/>
         </w:rPr>
-        <w:t xml:space="preserve">Resta perguntar até onde esse raciocínio autoriza conclusões, e a resposta é modesta. O IBAC (2024) adverte que a melhora observada depois de uma intervenção não permite concluir que a intervenção a produziu, e que um caso isolado não sustenta afirmações de eficácia para outros pacientes. A crítica mais incômoda vem de dentro da própria terapia cognitivo-comportamental: Bieling e Kuyken (2003 apud Neufeld; Cavenage, 2010, p. 16) concluem que a confiabilidade da conceitualização “pode ser obtida através dos aspectos descritivos do mesmo, mas não com os aspectos inferenciais”, ou seja, descrever o funcionamento é replicável, inferir crenças a partir dele não é. Pesa ainda que Persons et al. (2006 apud Neufeld; Cavenage, 2010) não encontraram diferença de desfecho entre pacientes tratados com e sem ênfase em conceitualização, e que as próprias autoras admitem que “a escassez de pesquisas na área traz dúvidas sobre o valor positivo da conceitualização de caso em TCC” (Neufeld; Cavenage, 2010, p. 30).</w:t>
+        <w:t xml:space="preserve">Os limites do estudo de caso são reconhecidos pelos próprios autores que o defendem. O IBAC (2024) adverte que a melhora observada após uma intervenção não autoriza concluir que a intervenção a produziu, e que um caso isolado não sustenta afirmações de eficácia para outros pacientes. Na própria terapia cognitivo-comportamental, Bieling e Kuyken (2003 apud Neufeld; Cavenage, 2010, p. 16) concluem que a confiabilidade da conceitualização “pode ser obtida através dos aspectos descritivos do mesmo, mas não com os aspectos inferenciais”, ou seja, descrever o funcionamento é replicável, mas inferir crenças a partir dessa descrição não é. Persons et al. (2006 apud Neufeld; Cavenage, 2010) não encontraram diferença de desfecho entre pacientes tratados com e sem ênfase em conceitualização, e as próprias Neufeld e Cavenage (2010, p. 30) reconhecem que “a escassez de pesquisas na área traz dúvidas sobre o valor positivo da conceitualização de caso em TCC”.</w:t>
       </w:r>
     </w:p>
     <w:p>
@@ -135,7 +135,7 @@
           <w:sz w:val="24"/>
           <w:szCs w:val="24"/>
         </w:rPr>
-        <w:t xml:space="preserve">Isso não desqualifica o instrumento, mas define seu estatuto: a formulação vale como organizador do raciocínio, não como prova. E a fragilidade inferencial não está no caso único em si, já que Leonardi e Meyer (2015, p. 1148) registram que a American Psychological Association “referenda diferentes tipos de métodos nomotéticos e idiográficos (ensaios clínicos randomizados, experimentos de caso único, estudos de caso)”, mas no delineamento descritivo que se escolhe. Fecha-se assim o percurso iniciado no começo: se o estudo de caso vale pelo que torna reconstruível, seus critérios de qualidade são os que Rangé (2004 apud Neufeld; Cavenage, 2010, p. 29) enumera — ter utilidade, ser simples, ser teoricamente coerente, explicar comportamentos passados, dar sentido aos presentes e permitir prever os futuros. Um caso que não cumpre isso pode estar bem escrito, mas não ensina nada a quem o lê.</w:t>
+        <w:t xml:space="preserve">Tais restrições não retiram do estudo de caso sua função formativa, mas delimitam o que ele autoriza afirmar. Leonardi e Meyer (2015, p. 1148) registram que a American Psychological Association “referenda diferentes tipos de métodos nomotéticos e idiográficos (ensaios clínicos randomizados, experimentos de caso único, estudos de caso)”, o que indica que a limitação inferencial decorre do delineamento descritivo adotado, e não do exame de um caso único. Quanto à avaliação da formulação, Rangé (2004 apud Neufeld; Cavenage, 2010, p. 29) enumera seis critérios: ter utilidade, ser simples, ser teoricamente coerente, oferecer explicações sobre comportamentos passados, encontrar sentido nos comportamentos presentes e ter capacidade para predizer comportamentos futuros.</w:t>
       </w:r>
     </w:p>
     <w:p>

</xml_diff>